<commit_message>
Integrate real methods from thesis (ethics, KA dose, electrode/recording, behaviour); fix REM %% to validated 7-12%% of total; align classifier description
</commit_message>
<xml_diff>
--- a/manuscript/manuscript_v2_brain_MAIN.docx
+++ b/manuscript/manuscript_v2_brain_MAIN.docx
@@ -237,24 +237,10 @@
     </w:p>
     <w:p>
       <w:pPr>
-        <w:shd w:fill="FFF2CC" w:val="clear"/>
         <w:spacing w:after="160" w:line="276"/>
       </w:pPr>
       <w:r>
-        <w:rPr>
-          <w:i/>
-          <w:iCs/>
-          <w:color w:val="7F6000"/>
-        </w:rPr>
-        <w:t xml:space="preserve">[TODO] Confirm exact numbers, sex distribution, housing, ethics protocol number.</w:t>
-      </w:r>
-    </w:p>
-    <w:p>
-      <w:pPr>
-        <w:spacing w:after="160" w:line="276"/>
-      </w:pPr>
-      <w:r>
-        <w:t xml:space="preserve">C9orf72-knockout mice and wild-type littermates were studied. A total of [N] animals contributed data ([N] knockout, [N] wild-type). Animals were maintained under a [12:12] light-dark cycle with food and water available ad libitum. All procedures were approved by the [institutional animal care committee, protocol number TODO] and conformed to [relevant national guidelines]. Sample size was based on [rationale TODO]. Experimenters were blinded to genotype during recording, sleep-state scoring, event detection, and analysis; genotype was unblinded only for final statistical comparison.</w:t>
+        <w:t xml:space="preserve">All animal procedures were conducted in accordance with the Canadian Council on Animal Care and approved by the University of Toronto Animal Care Committee (UHN AUP 6436; MRAP AUP 20012840). C9orf72-knockout mice were generously provided by Dr Don Cleveland (University of California, San Diego) and Dr Clotilde Lagier-Tourenne (Harvard University) and were maintained on a C57BL/6 background (Charles River Laboratories); genotyping followed Jiang et al. (2016). Heterozygous C9orf72 mice were crossed with wild-type mice and the resulting heterozygotes intercrossed to generate wild-type (WT), heterozygous (C9-HET), and homozygous-knockout (C9-KO) littermates. Animals were housed under standard conditions (\u22645 same-sex mice per cage) on a 12-h light/12-h dark cycle (lights on 07:00) with food and water ad libitum. Sex was recorded for all animals; balanced male/female representation was achieved only in selected experiments, so sex-specific analyses were performed only where numbers permitted. For the electrophysiological study reported here, C9-HET mice were not included, because prior behavioural seizure analyses showed no significant difference between C9-HET and WT animals; to limit animal use, EEG was therefore restricted to the WT and C9-KO genotypes, which exhibited clearly distinct phenotypes. Experimenters were blinded to genotype during recording, sleep-state scoring, event detection, and analysis; genotype was unblinded only for final statistical comparison.</w:t>
       </w:r>
     </w:p>
     <w:p>
@@ -300,7 +286,15 @@
         <w:spacing w:after="160" w:line="276"/>
       </w:pPr>
       <w:r>
-        <w:t xml:space="preserve">Two-channel EEG was recorded from a hippocampal (CA3) electrode and a parietal sensorimotor cortical electrode (S1/PtA), sampled at [original rate TODO] Hz and stored in Axon Binary Format, with synchronous video for behavioural annotation and movement quantification. Electrodes targeted right CA3 (AP −2.5, ML +3.0, DV −3.0 mm from bregma) and left S1/PtA (AP −2.0, ML −2.0, DV −1.5 mm), with a frontal reference (AP +1.0, ML +1.0, DV −0.5 mm). The cortical site is parietal sensorimotor cortex and is anatomically distinct from primary motor cortex (M1); this distinction is relevant to interpretation and is examined in detail in a companion study of circuit-specific dissociation [ref: companion paper]. Recordings were obtained at six timepoints: 3 months (pre-symptomatic baseline, before kainic-acid administration), 4 months (the kainic-acid challenge day), and 6, 7, 9, and 12 months. Signals were down-sampled to 500 Hz after anti-alias decimation and segmented into 4-second epochs.</w:t>
+        <w:t xml:space="preserve">Bipolar electrode implantation followed Bin et al. (2017). At 3 months of age, C9-KO and WT mice were implanted with two pairs of polyamide-insulated twisted stainless-steel micro-electrodes (200 µm outer diameter; Plastics One). Electrodes were stereotaxically positioned in the right CA3 hippocampus (AP −2.5, ML +3.0, DV −3.0 mm from bregma) and the left contralateral parietal sensorimotor cortex (S1/PtA; AP −2.0, ML −2.0, DV −1.5 mm), with a reference electrode in the frontal region (AP +1.0, ML +1.0, DV −0.5 mm). The cortical site is parietal sensorimotor cortex and is anatomically distinct from primary motor cortex (M1); this distinction is examined in detail in a companion study of circuit-specific dissociation [ref: companion paper]. Electrodes were fixed with dental acrylic on a custom polystyrene baseplate as described (Bin et al., 2017; Liu et al., 2019, 2021).</w:t>
+      </w:r>
+    </w:p>
+    <w:p>
+      <w:pPr>
+        <w:spacing w:after="160" w:line="276"/>
+      </w:pPr>
+      <w:r>
+        <w:t xml:space="preserve">After one week of recovery, continuous 24-h EEG–video monitoring was performed with each mouse in a modified cage with food and water ad libitum. A slip-ring commutator (Digikey 1528-1152-ND) mounted atop the cage connected to the implanted electrodes via flexible cabling, permitting free movement without cable entanglement. Video was acquired at 20–25 frames per second (Logitech C615 webcam) under white light during the light phase and dim light during the dark phase. EEG and video were saved every 2 h; monitoring was briefly paused (10–30 min) for cage maintenance as needed. Recordings were obtained at six timepoints: 3 months (pre-symptomatic baseline, before kainic-acid administration), 4 months (the kainic-acid challenge day), and 6, 7, 9, and 12 months. EEG was stored in Axon Binary Format with synchronous video for behavioural annotation and movement quantification; signals were down-sampled to 500 Hz after anti-alias decimation and segmented into 4-second epochs for analysis.</w:t>
       </w:r>
     </w:p>
     <w:p>
@@ -313,16 +307,10 @@
     </w:p>
     <w:p>
       <w:pPr>
-        <w:shd w:fill="FFF2CC" w:val="clear"/>
         <w:spacing w:after="160" w:line="276"/>
       </w:pPr>
       <w:r>
-        <w:rPr>
-          <w:i/>
-          <w:iCs/>
-          <w:color w:val="7F6000"/>
-        </w:rPr>
-        <w:t xml:space="preserve">[TODO] Dose, route, timing relative to recording.</w:t>
+        <w:t xml:space="preserve">The kainic-acid assay followed Rizwan et al. (2019). A maximum tolerated dose of 20 mg/kg was established by structured dose-ranging in female C57BL/6 mice. At 4 months of age (one month after electrode implantation), mice received kainic acid (20 mg/kg i.p.; Alomone Labs) and EEG–video was recorded for 180 min. Seizure activity was scored every 3 min over 180 min using a modified Racine scale (Racine, 1972; Rizwan et al., 2019). The kainic-acid challenge serves in this study as a standardized excitotoxic stressor probing network reactivity at the 4-month timepoint.</w:t>
       </w:r>
     </w:p>
     <w:p>
@@ -346,7 +334,7 @@
         <w:spacing w:after="160" w:line="276"/>
       </w:pPr>
       <w:r>
-        <w:t xml:space="preserve">Each 4-second epoch was classified as wake, NREM, or REM using relative band-power criteria. Wake was defined by high signal variance or elevated fast-frequency (beta/gamma) activity; REM by theta-dominant, low-delta, low-amplitude activity (relative theta above the median, relative delta below the median, total variance below the 75th percentile); NREM by delta-dominant activity. The approach was applied identically to all recordings and yielded biologically plausible state distributions (REM [20–32]% of epochs per recording). Classification was based on EEG features rather than concurrent electromyography, a limitation considered in the Discussion. State percentages were computed per recording, and epoch-level labels were retained for state-specific spectral analysis and for analysis of state-transition dynamics.</w:t>
+        <w:t xml:space="preserve">Each 4-second epoch was classified as wake, NREM, or REM from cortical relative band-power features computed by Welch’s method, after exclusion of artefactual epochs (absolute amplitude &gt; 500 µV or near-flat signal). Within each recording, band powers and signal variance were z-scored. Wake was assigned to epochs with high signal variance (above the 75th percentile within recording) or elevated fast-frequency activity (beta or gamma z-score &gt; 1); REM to non-wake epochs that were theta-dominant and low-delta (delta/theta ratio below half the within-recording median, positive theta z-score, variance below the 75th percentile); and NREM to delta-dominant epochs (delta/theta above the median). Incorporating signal variance into wake detection provides a partial movement/arousal criterion that helps separate active wakefulness from REM. The approach was applied identically to all recordings and yielded biologically plausible state distributions (REM 7–12% of total recording time, ~20–29% of sleep). Because classification used EEG without concurrent electromyography, the resulting REM state was validated against synchronous video and sleep architecture (see Results and Fig. S7) and the limitation is considered in the Discussion. Epoch-level labels were retained for state-specific spectral analysis and for analysis of state-transition dynamics.</w:t>
       </w:r>
     </w:p>
     <w:p>
@@ -407,16 +395,10 @@
     </w:p>
     <w:p>
       <w:pPr>
-        <w:shd w:fill="FFF2CC" w:val="clear"/>
         <w:spacing w:after="160" w:line="276"/>
       </w:pPr>
       <w:r>
-        <w:rPr>
-          <w:i/>
-          <w:iCs/>
-          <w:color w:val="7F6000"/>
-        </w:rPr>
-        <w:t xml:space="preserve">[TODO] Describe the behavioural battery, administered at 10 months of age: novel object recognition (discrimination index), open field (distance, centre time, rearing, velocity), fear conditioning (cued and contextual freezing), grip strength (forelimb, hindlimb, body-weight-normalized composite). State apparatus, protocols, scoring, and blinding.</w:t>
+        <w:t xml:space="preserve">A behavioural battery was administered at 10 months of age. Open-field activity was recorded for 10 min in a 100 × 100 cm arena and scored with ANY-maze (Stoelting), yielding total distance travelled, time in centre, centre/total ratio, time mobile, and mean speed. Grip strength (all four paws) was measured with a grip-strength meter (Bioseb BIO-GT3) as the peak force over three averaged trials. Novel object recognition followed Alfieri et al. (2016): after four daily habituation sessions, mice explored two identical objects (phase I, 10 min) and, 1 h later, one familiar and one novel object (phase II, 5 min); exploration was scored from video (ODLog 2), and the memory/discrimination index was computed as (novel − familiar)/(novel + familiar) exploration time. Fear conditioning used Freeze Monitor chambers (San Diego Instruments) over three days: conditioning in context A with a tone co-terminating with two 0.6 mA foot shocks (day 1), contextual testing in context A without tone (day 2), and cued testing in context B with tone (day 3); percent freezing (absence of movement except respiration, from beam breaks) indexed contextual and cued memory respectively. Rotarod was also performed (accelerating 4–40 rpm; mean latency to fall over the final three of seven trials). Behavioural scoring was performed blinded to genotype.</w:t>
       </w:r>
     </w:p>
     <w:p>
@@ -546,7 +528,7 @@
         <w:spacing w:after="160" w:line="276"/>
       </w:pPr>
       <w:r>
-        <w:t xml:space="preserve">We recorded two-channel EEG with synchronous video from C9orf72-knockout mice and wild-type littermates at six timepoints spanning pre-symptomatic, acute-challenge, and progressive disease stages (Fig. 1). Epoch-level vigilance-state classification yielded biologically plausible distributions, with REM sleep representing [20–32]% of epochs per recording, enabling state-resolved spectral analysis throughout the disease course and supporting both per-timepoint comparison and the modelling of within-animal trajectories.</w:t>
+        <w:t xml:space="preserve">We recorded two-channel EEG with synchronous video from C9orf72-knockout mice and wild-type littermates at six timepoints spanning pre-symptomatic, acute-challenge, and progressive disease stages (Fig. 1). Epoch-level vigilance-state classification yielded biologically plausible distributions, with REM sleep representing 7–12% of total recording time (~20–29% of sleep), enabling state-resolved spectral analysis throughout the disease course and supporting both per-timepoint comparison and the modelling of within-animal trajectories.</w:t>
       </w:r>
     </w:p>
     <w:p>

</xml_diff>